<commit_message>
feat(pwa): refrescar la lista de cachés al terminar la demostración; docs: URL pública en el documento
</commit_message>
<xml_diff>
--- a/docs/api-cache/API_Cache_PWA_Rodando_UTP.docx
+++ b/docs/api-cache/API_Cache_PWA_Rodando_UTP.docx
@@ -2671,7 +2671,7 @@
           <w:rFonts w:ascii="Times New Roman" w:hAnsi="Times New Roman"/>
           <w:sz w:val="24"/>
         </w:rPr>
-        <w:t>La aplicación se probó en local con Chrome sobre el contenedor Docker del proyecto (HTTP en localhost, que el navegador considera contexto seguro). En la primera visita el service worker se instaló y precacheó 21 recursos; tras navegar por la aplicación, la caché pasó a 23 entradas, incluidas las respuestas de la API pública guardadas con cache.put(). La Figura 1 muestra la aplicación en marcha.</w:t>
+        <w:t>La aplicación está publicada en Render (Web Service Docker con PostgreSQL administrado) y se verificó tanto en local, sobre el contenedor Docker del proyecto, como en la URL pública https://rodando-utp-m12i.onrender.com, que el navegador trata como contexto seguro por usar HTTPS y donde el service worker se registra correctamente. En la primera visita el service worker se instaló y precacheó 21 recursos; tras navegar por la aplicación, la caché pasó a 23 entradas, incluidas las respuestas de la API pública guardadas con cache.put(). La Figura 1 muestra la aplicación en marcha.</w:t>
       </w:r>
     </w:p>
     <w:p>
@@ -2682,7 +2682,7 @@
       <w:r>
         <w:drawing>
           <wp:inline xmlns:a="http://schemas.openxmlformats.org/drawingml/2006/main" xmlns:pic="http://schemas.openxmlformats.org/drawingml/2006/picture">
-            <wp:extent cx="5760720" cy="51362209"/>
+            <wp:extent cx="5760720" cy="50578953"/>
             <wp:docPr id="1" name="Picture 1"/>
             <wp:cNvGraphicFramePr>
               <a:graphicFrameLocks noChangeAspect="1"/>
@@ -2703,7 +2703,7 @@
                   <pic:spPr>
                     <a:xfrm>
                       <a:off x="0" y="0"/>
-                      <a:ext cx="5760720" cy="51362209"/>
+                      <a:ext cx="5760720" cy="50578953"/>
                     </a:xfrm>
                     <a:prstGeom prst="rect"/>
                   </pic:spPr>
@@ -2725,7 +2725,7 @@
           <w:i/>
           <w:sz w:val="22"/>
         </w:rPr>
-        <w:t>Figura 1. Página principal de Rodando UTP servida por la PWA; el service worker quedó activo y precacheó los archivos base de la aplicación.</w:t>
+        <w:t>Figura 1. Página principal de Rodando UTP publicada en Render, servida por la PWA; el service worker quedó activo y precacheó los archivos base de la aplicación.</w:t>
       </w:r>
     </w:p>
     <w:p>
@@ -2750,7 +2750,7 @@
       <w:r>
         <w:drawing>
           <wp:inline xmlns:a="http://schemas.openxmlformats.org/drawingml/2006/main" xmlns:pic="http://schemas.openxmlformats.org/drawingml/2006/picture">
-            <wp:extent cx="5760720" cy="15647132"/>
+            <wp:extent cx="5760720" cy="15812329"/>
             <wp:docPr id="2" name="Picture 2"/>
             <wp:cNvGraphicFramePr>
               <a:graphicFrameLocks noChangeAspect="1"/>
@@ -2771,7 +2771,7 @@
                   <pic:spPr>
                     <a:xfrm>
                       <a:off x="0" y="0"/>
-                      <a:ext cx="5760720" cy="15647132"/>
+                      <a:ext cx="5760720" cy="15812329"/>
                     </a:xfrm>
                     <a:prstGeom prst="rect"/>
                   </pic:spPr>
@@ -2818,7 +2818,7 @@
       <w:r>
         <w:drawing>
           <wp:inline xmlns:a="http://schemas.openxmlformats.org/drawingml/2006/main" xmlns:pic="http://schemas.openxmlformats.org/drawingml/2006/picture">
-            <wp:extent cx="5760720" cy="10564144"/>
+            <wp:extent cx="5760720" cy="10195627"/>
             <wp:docPr id="3" name="Picture 3"/>
             <wp:cNvGraphicFramePr>
               <a:graphicFrameLocks noChangeAspect="1"/>
@@ -2839,7 +2839,7 @@
                   <pic:spPr>
                     <a:xfrm>
                       <a:off x="0" y="0"/>
-                      <a:ext cx="5760720" cy="10564144"/>
+                      <a:ext cx="5760720" cy="10195627"/>
                     </a:xfrm>
                     <a:prstGeom prst="rect"/>
                   </pic:spPr>
@@ -2875,7 +2875,7 @@
           <w:rFonts w:ascii="Times New Roman" w:hAnsi="Times New Roman"/>
           <w:sz w:val="24"/>
         </w:rPr>
-        <w:t>Por último se cortó la red con las herramientas de desarrollo y se recargó el laboratorio. La página respondió desde la caché: el service worker siguió activo, la barra de aviso sin conexión apareció y las entradas aumentaron a 23 porque también se guardaron las respuestas de la API pública (Figura 4). Con esto queda comprobado el arranque sin conexión, que es el objetivo principal de la caché en una PWA.</w:t>
+        <w:t>Por último se cortó la red con las herramientas de desarrollo y se recargó el laboratorio en la aplicación publicada. La página respondió desde la caché: el service worker siguió activo, la barra de aviso sin conexión apareció y las entradas aumentaron a 23 porque también se guardaron las respuestas de la API pública (Figura 4). Con esto queda comprobado el arranque sin conexión, que es el objetivo principal de la caché en una PWA.</w:t>
       </w:r>
     </w:p>
     <w:p>
@@ -3203,7 +3203,7 @@
           <w:rFonts w:ascii="Times New Roman" w:hAnsi="Times New Roman"/>
           <w:sz w:val="24"/>
         </w:rPr>
-        <w:t>Aplicación publicada (PWA): https://rodando-utp.onrender.com</w:t>
+        <w:t>Aplicación publicada (PWA): https://rodando-utp-m12i.onrender.com</w:t>
       </w:r>
     </w:p>
     <w:p>
@@ -3217,7 +3217,7 @@
           <w:rFonts w:ascii="Times New Roman" w:hAnsi="Times New Roman"/>
           <w:sz w:val="24"/>
         </w:rPr>
-        <w:t>Laboratorio de caché dentro de la aplicación: https://rodando-utp.onrender.com/cache.html</w:t>
+        <w:t>Laboratorio de caché dentro de la aplicación: https://rodando-utp-m12i.onrender.com/cache.html</w:t>
       </w:r>
     </w:p>
     <w:p>

</xml_diff>

<commit_message>
docs(api-cache): capturas de vista de pantalla en la URL pública de Render
</commit_message>
<xml_diff>
--- a/docs/api-cache/API_Cache_PWA_Rodando_UTP.docx
+++ b/docs/api-cache/API_Cache_PWA_Rodando_UTP.docx
@@ -2682,7 +2682,7 @@
       <w:r>
         <w:drawing>
           <wp:inline xmlns:a="http://schemas.openxmlformats.org/drawingml/2006/main" xmlns:pic="http://schemas.openxmlformats.org/drawingml/2006/picture">
-            <wp:extent cx="5760720" cy="50578953"/>
+            <wp:extent cx="5760720" cy="3690461"/>
             <wp:docPr id="1" name="Picture 1"/>
             <wp:cNvGraphicFramePr>
               <a:graphicFrameLocks noChangeAspect="1"/>
@@ -2703,7 +2703,7 @@
                   <pic:spPr>
                     <a:xfrm>
                       <a:off x="0" y="0"/>
-                      <a:ext cx="5760720" cy="50578953"/>
+                      <a:ext cx="5760720" cy="3690461"/>
                     </a:xfrm>
                     <a:prstGeom prst="rect"/>
                   </pic:spPr>
@@ -2750,7 +2750,7 @@
       <w:r>
         <w:drawing>
           <wp:inline xmlns:a="http://schemas.openxmlformats.org/drawingml/2006/main" xmlns:pic="http://schemas.openxmlformats.org/drawingml/2006/picture">
-            <wp:extent cx="5760720" cy="15812329"/>
+            <wp:extent cx="5760720" cy="4320540"/>
             <wp:docPr id="2" name="Picture 2"/>
             <wp:cNvGraphicFramePr>
               <a:graphicFrameLocks noChangeAspect="1"/>
@@ -2771,7 +2771,7 @@
                   <pic:spPr>
                     <a:xfrm>
                       <a:off x="0" y="0"/>
-                      <a:ext cx="5760720" cy="15812329"/>
+                      <a:ext cx="5760720" cy="4320540"/>
                     </a:xfrm>
                     <a:prstGeom prst="rect"/>
                   </pic:spPr>
@@ -2818,7 +2818,7 @@
       <w:r>
         <w:drawing>
           <wp:inline xmlns:a="http://schemas.openxmlformats.org/drawingml/2006/main" xmlns:pic="http://schemas.openxmlformats.org/drawingml/2006/picture">
-            <wp:extent cx="5760720" cy="10195627"/>
+            <wp:extent cx="5760720" cy="4050506"/>
             <wp:docPr id="3" name="Picture 3"/>
             <wp:cNvGraphicFramePr>
               <a:graphicFrameLocks noChangeAspect="1"/>
@@ -2839,7 +2839,7 @@
                   <pic:spPr>
                     <a:xfrm>
                       <a:off x="0" y="0"/>
-                      <a:ext cx="5760720" cy="10195627"/>
+                      <a:ext cx="5760720" cy="4050506"/>
                     </a:xfrm>
                     <a:prstGeom prst="rect"/>
                   </pic:spPr>
@@ -2886,7 +2886,7 @@
       <w:r>
         <w:drawing>
           <wp:inline xmlns:a="http://schemas.openxmlformats.org/drawingml/2006/main" xmlns:pic="http://schemas.openxmlformats.org/drawingml/2006/picture">
-            <wp:extent cx="5760720" cy="16235912"/>
+            <wp:extent cx="5760720" cy="3298912"/>
             <wp:docPr id="4" name="Picture 4"/>
             <wp:cNvGraphicFramePr>
               <a:graphicFrameLocks noChangeAspect="1"/>
@@ -2907,7 +2907,7 @@
                   <pic:spPr>
                     <a:xfrm>
                       <a:off x="0" y="0"/>
-                      <a:ext cx="5760720" cy="16235912"/>
+                      <a:ext cx="5760720" cy="3298912"/>
                     </a:xfrm>
                     <a:prstGeom prst="rect"/>
                   </pic:spPr>

</xml_diff>